<commit_message>
Replace ecological proxy with actual per-trust BME vs White likelihood ratios
Uses benchmark file ethnicity breakdowns (equal_eth_summary, q16b_eth_summary,
har_from_pat/staff_eth_summary) to compute LR = P(outcome|BME) / P(outcome|White)
per trust. Key findings: Q16b discrimination LR median 2.3x, Q15 fair career
progression LR 0.85 (BME 1.2x less likely), harassment LRs ~1.2x.

https://claude.ai/code/session_01MBYssKwPmq3tE1Z6L26PN7
</commit_message>
<xml_diff>
--- a/output/NOF_2024_Factor_Analysis_Report.docx
+++ b/output/NOF_2024_Factor_Analysis_Report.docx
@@ -20619,17 +20619,17 @@
         <w:pStyle w:val="Heading1"/>
       </w:pPr>
       <w:r>
-        <w:t>5. Tackling Racism: Likelihood Ratio Approach</w:t>
+        <w:t>5. Tackling Racism: Likelihood Ratio (BME vs White)</w:t>
       </w:r>
     </w:p>
     <w:p>
       <w:r>
-        <w:t>The policy specifies that Tackling Racism items should use a BME vs White comparator — specifically a likelihood ratio of P(outcome | BME) / P(outcome | White). This requires individual-level response data broken down by ethnicity, which is not available in the NSS organisational results spreadsheet.</w:t>
+        <w:t>The policy specifies that Tackling Racism items should use a BME vs White comparator — specifically a likelihood ratio: P(outcome | BME) / P(outcome | White). Using the NHS Staff Survey benchmark data, we computed per-trust likelihood ratios for each racism-related indicator where ethnicity breakdowns are available.</w:t>
       </w:r>
     </w:p>
     <w:p>
       <w:r>
-        <w:t>As a proxy, we computed ecological correlations: does the org-level % BME staff correlate with the org-level discrimination rate? A positive correlation is consistent with (but not identical to) a BME/White disparity.</w:t>
+        <w:t>A likelihood ratio (LR) &gt; 1 for negative outcomes (discrimination, harassment) means BME staff are more likely to experience those outcomes. For positive outcomes (fair career progression), an LR &lt; 1 means BME staff are less likely to report positively.</w:t>
       </w:r>
     </w:p>
     <w:p>
@@ -20637,7 +20637,7 @@
         <w:pStyle w:val="Heading2"/>
       </w:pPr>
       <w:r>
-        <w:t>Ecological Correlations: % BME Staff vs Discrimination Rates</w:t>
+        <w:t>Likelihood Ratio Summary Across Trusts</w:t>
       </w:r>
     </w:p>
     <w:tbl>
@@ -20648,17 +20648,22 @@
         <w:tblLook w:firstColumn="1" w:firstRow="1" w:lastColumn="0" w:lastRow="0" w:noHBand="0" w:noVBand="1" w:val="04A0"/>
       </w:tblPr>
       <w:tblGrid>
-        <w:gridCol w:w="2523"/>
-        <w:gridCol w:w="2523"/>
-        <w:gridCol w:w="2523"/>
-        <w:gridCol w:w="2523"/>
-        <w:gridCol w:w="2523"/>
-        <w:gridCol w:w="2523"/>
+        <w:gridCol w:w="1376"/>
+        <w:gridCol w:w="1376"/>
+        <w:gridCol w:w="1376"/>
+        <w:gridCol w:w="1376"/>
+        <w:gridCol w:w="1376"/>
+        <w:gridCol w:w="1376"/>
+        <w:gridCol w:w="1376"/>
+        <w:gridCol w:w="1376"/>
+        <w:gridCol w:w="1376"/>
+        <w:gridCol w:w="1376"/>
+        <w:gridCol w:w="1376"/>
       </w:tblGrid>
       <w:tr>
         <w:tc>
           <w:tcPr>
-            <w:tcW w:type="dxa" w:w="2523"/>
+            <w:tcW w:type="dxa" w:w="1376"/>
           </w:tcPr>
           <w:p>
             <w:pPr>
@@ -20669,13 +20674,13 @@
                 <w:b/>
                 <w:sz w:val="18"/>
               </w:rPr>
-              <w:t>Variable</w:t>
-            </w:r>
-          </w:p>
-        </w:tc>
-        <w:tc>
-          <w:tcPr>
-            <w:tcW w:type="dxa" w:w="2523"/>
+              <w:t>Indicator</w:t>
+            </w:r>
+          </w:p>
+        </w:tc>
+        <w:tc>
+          <w:tcPr>
+            <w:tcW w:type="dxa" w:w="1376"/>
           </w:tcPr>
           <w:p>
             <w:pPr>
@@ -20686,13 +20691,13 @@
                 <w:b/>
                 <w:sz w:val="18"/>
               </w:rPr>
-              <w:t>Question</w:t>
-            </w:r>
-          </w:p>
-        </w:tc>
-        <w:tc>
-          <w:tcPr>
-            <w:tcW w:type="dxa" w:w="2523"/>
+              <w:t>N Trusts</w:t>
+            </w:r>
+          </w:p>
+        </w:tc>
+        <w:tc>
+          <w:tcPr>
+            <w:tcW w:type="dxa" w:w="1376"/>
           </w:tcPr>
           <w:p>
             <w:pPr>
@@ -20703,13 +20708,13 @@
                 <w:b/>
                 <w:sz w:val="18"/>
               </w:rPr>
-              <w:t>N Orgs</w:t>
-            </w:r>
-          </w:p>
-        </w:tc>
-        <w:tc>
-          <w:tcPr>
-            <w:tcW w:type="dxa" w:w="2523"/>
+              <w:t>Median LR</w:t>
+            </w:r>
+          </w:p>
+        </w:tc>
+        <w:tc>
+          <w:tcPr>
+            <w:tcW w:type="dxa" w:w="1376"/>
           </w:tcPr>
           <w:p>
             <w:pPr>
@@ -20720,13 +20725,13 @@
                 <w:b/>
                 <w:sz w:val="18"/>
               </w:rPr>
-              <w:t>Correlation with % BME staff</w:t>
-            </w:r>
-          </w:p>
-        </w:tc>
-        <w:tc>
-          <w:tcPr>
-            <w:tcW w:type="dxa" w:w="2523"/>
+              <w:t>Mean LR</w:t>
+            </w:r>
+          </w:p>
+        </w:tc>
+        <w:tc>
+          <w:tcPr>
+            <w:tcW w:type="dxa" w:w="1376"/>
           </w:tcPr>
           <w:p>
             <w:pPr>
@@ -20737,13 +20742,13 @@
                 <w:b/>
                 <w:sz w:val="18"/>
               </w:rPr>
-              <w:t>p-value</w:t>
-            </w:r>
-          </w:p>
-        </w:tc>
-        <w:tc>
-          <w:tcPr>
-            <w:tcW w:type="dxa" w:w="2523"/>
+              <w:t>SD LR</w:t>
+            </w:r>
+          </w:p>
+        </w:tc>
+        <w:tc>
+          <w:tcPr>
+            <w:tcW w:type="dxa" w:w="1376"/>
           </w:tcPr>
           <w:p>
             <w:pPr>
@@ -20754,6 +20759,91 @@
                 <w:b/>
                 <w:sz w:val="18"/>
               </w:rPr>
+              <w:t>Min LR</w:t>
+            </w:r>
+          </w:p>
+        </w:tc>
+        <w:tc>
+          <w:tcPr>
+            <w:tcW w:type="dxa" w:w="1376"/>
+          </w:tcPr>
+          <w:p>
+            <w:pPr>
+              <w:jc w:val="center"/>
+            </w:pPr>
+            <w:r>
+              <w:rPr>
+                <w:b/>
+                <w:sz w:val="18"/>
+              </w:rPr>
+              <w:t>Q25 LR</w:t>
+            </w:r>
+          </w:p>
+        </w:tc>
+        <w:tc>
+          <w:tcPr>
+            <w:tcW w:type="dxa" w:w="1376"/>
+          </w:tcPr>
+          <w:p>
+            <w:pPr>
+              <w:jc w:val="center"/>
+            </w:pPr>
+            <w:r>
+              <w:rPr>
+                <w:b/>
+                <w:sz w:val="18"/>
+              </w:rPr>
+              <w:t>Q75 LR</w:t>
+            </w:r>
+          </w:p>
+        </w:tc>
+        <w:tc>
+          <w:tcPr>
+            <w:tcW w:type="dxa" w:w="1376"/>
+          </w:tcPr>
+          <w:p>
+            <w:pPr>
+              <w:jc w:val="center"/>
+            </w:pPr>
+            <w:r>
+              <w:rPr>
+                <w:b/>
+                <w:sz w:val="18"/>
+              </w:rPr>
+              <w:t>Max LR</w:t>
+            </w:r>
+          </w:p>
+        </w:tc>
+        <w:tc>
+          <w:tcPr>
+            <w:tcW w:type="dxa" w:w="1376"/>
+          </w:tcPr>
+          <w:p>
+            <w:pPr>
+              <w:jc w:val="center"/>
+            </w:pPr>
+            <w:r>
+              <w:rPr>
+                <w:b/>
+                <w:sz w:val="18"/>
+              </w:rPr>
+              <w:t>Direction</w:t>
+            </w:r>
+          </w:p>
+        </w:tc>
+        <w:tc>
+          <w:tcPr>
+            <w:tcW w:type="dxa" w:w="1376"/>
+          </w:tcPr>
+          <w:p>
+            <w:pPr>
+              <w:jc w:val="center"/>
+            </w:pPr>
+            <w:r>
+              <w:rPr>
+                <w:b/>
+                <w:sz w:val="18"/>
+              </w:rPr>
               <w:t>Interpretation</w:t>
             </w:r>
           </w:p>
@@ -20762,97 +20852,177 @@
       <w:tr>
         <w:tc>
           <w:tcPr>
-            <w:tcW w:type="dxa" w:w="2523"/>
-          </w:tcPr>
-          <w:p>
-            <w:pPr>
-              <w:jc w:val="center"/>
-            </w:pPr>
-            <w:r>
-              <w:rPr>
-                <w:sz w:val="16"/>
-              </w:rPr>
-              <w:t>fair_career_progression</w:t>
-            </w:r>
-          </w:p>
-        </w:tc>
-        <w:tc>
-          <w:tcPr>
-            <w:tcW w:type="dxa" w:w="2523"/>
-          </w:tcPr>
-          <w:p>
-            <w:pPr>
-              <w:jc w:val="center"/>
-            </w:pPr>
-            <w:r>
-              <w:rPr>
-                <w:sz w:val="16"/>
-              </w:rPr>
-              <w:t>Q15: Fair career progression (% Yes)</w:t>
-            </w:r>
-          </w:p>
-        </w:tc>
-        <w:tc>
-          <w:tcPr>
-            <w:tcW w:type="dxa" w:w="2523"/>
-          </w:tcPr>
-          <w:p>
-            <w:pPr>
-              <w:jc w:val="center"/>
-            </w:pPr>
-            <w:r>
-              <w:rPr>
-                <w:sz w:val="16"/>
-              </w:rPr>
-              <w:t>263</w:t>
-            </w:r>
-          </w:p>
-        </w:tc>
-        <w:tc>
-          <w:tcPr>
-            <w:tcW w:type="dxa" w:w="2523"/>
-          </w:tcPr>
-          <w:p>
-            <w:pPr>
-              <w:jc w:val="center"/>
-            </w:pPr>
-            <w:r>
-              <w:rPr>
-                <w:sz w:val="16"/>
-              </w:rPr>
-              <w:t>-0.349</w:t>
-            </w:r>
-          </w:p>
-        </w:tc>
-        <w:tc>
-          <w:tcPr>
-            <w:tcW w:type="dxa" w:w="2523"/>
-          </w:tcPr>
-          <w:p>
-            <w:pPr>
-              <w:jc w:val="center"/>
-            </w:pPr>
-            <w:r>
-              <w:rPr>
-                <w:sz w:val="16"/>
-              </w:rPr>
-              <w:t>0.000</w:t>
-            </w:r>
-          </w:p>
-        </w:tc>
-        <w:tc>
-          <w:tcPr>
-            <w:tcW w:type="dxa" w:w="2523"/>
-          </w:tcPr>
-          <w:p>
-            <w:pPr>
-              <w:jc w:val="center"/>
-            </w:pPr>
-            <w:r>
-              <w:rPr>
-                <w:sz w:val="16"/>
-              </w:rPr>
-              <w:t>Higher BME % -&gt; lower discrimination</w:t>
+            <w:tcW w:type="dxa" w:w="1376"/>
+          </w:tcPr>
+          <w:p>
+            <w:pPr>
+              <w:jc w:val="center"/>
+            </w:pPr>
+            <w:r>
+              <w:rPr>
+                <w:sz w:val="16"/>
+              </w:rPr>
+              <w:t>Q15: Fair career progression</w:t>
+            </w:r>
+          </w:p>
+        </w:tc>
+        <w:tc>
+          <w:tcPr>
+            <w:tcW w:type="dxa" w:w="1376"/>
+          </w:tcPr>
+          <w:p>
+            <w:pPr>
+              <w:jc w:val="center"/>
+            </w:pPr>
+            <w:r>
+              <w:rPr>
+                <w:sz w:val="16"/>
+              </w:rPr>
+              <w:t>159</w:t>
+            </w:r>
+          </w:p>
+        </w:tc>
+        <w:tc>
+          <w:tcPr>
+            <w:tcW w:type="dxa" w:w="1376"/>
+          </w:tcPr>
+          <w:p>
+            <w:pPr>
+              <w:jc w:val="center"/>
+            </w:pPr>
+            <w:r>
+              <w:rPr>
+                <w:sz w:val="16"/>
+              </w:rPr>
+              <w:t>0.848</w:t>
+            </w:r>
+          </w:p>
+        </w:tc>
+        <w:tc>
+          <w:tcPr>
+            <w:tcW w:type="dxa" w:w="1376"/>
+          </w:tcPr>
+          <w:p>
+            <w:pPr>
+              <w:jc w:val="center"/>
+            </w:pPr>
+            <w:r>
+              <w:rPr>
+                <w:sz w:val="16"/>
+              </w:rPr>
+              <w:t>0.852</w:t>
+            </w:r>
+          </w:p>
+        </w:tc>
+        <w:tc>
+          <w:tcPr>
+            <w:tcW w:type="dxa" w:w="1376"/>
+          </w:tcPr>
+          <w:p>
+            <w:pPr>
+              <w:jc w:val="center"/>
+            </w:pPr>
+            <w:r>
+              <w:rPr>
+                <w:sz w:val="16"/>
+              </w:rPr>
+              <w:t>0.071</w:t>
+            </w:r>
+          </w:p>
+        </w:tc>
+        <w:tc>
+          <w:tcPr>
+            <w:tcW w:type="dxa" w:w="1376"/>
+          </w:tcPr>
+          <w:p>
+            <w:pPr>
+              <w:jc w:val="center"/>
+            </w:pPr>
+            <w:r>
+              <w:rPr>
+                <w:sz w:val="16"/>
+              </w:rPr>
+              <w:t>0.694</w:t>
+            </w:r>
+          </w:p>
+        </w:tc>
+        <w:tc>
+          <w:tcPr>
+            <w:tcW w:type="dxa" w:w="1376"/>
+          </w:tcPr>
+          <w:p>
+            <w:pPr>
+              <w:jc w:val="center"/>
+            </w:pPr>
+            <w:r>
+              <w:rPr>
+                <w:sz w:val="16"/>
+              </w:rPr>
+              <w:t>0.805</w:t>
+            </w:r>
+          </w:p>
+        </w:tc>
+        <w:tc>
+          <w:tcPr>
+            <w:tcW w:type="dxa" w:w="1376"/>
+          </w:tcPr>
+          <w:p>
+            <w:pPr>
+              <w:jc w:val="center"/>
+            </w:pPr>
+            <w:r>
+              <w:rPr>
+                <w:sz w:val="16"/>
+              </w:rPr>
+              <w:t>0.895</w:t>
+            </w:r>
+          </w:p>
+        </w:tc>
+        <w:tc>
+          <w:tcPr>
+            <w:tcW w:type="dxa" w:w="1376"/>
+          </w:tcPr>
+          <w:p>
+            <w:pPr>
+              <w:jc w:val="center"/>
+            </w:pPr>
+            <w:r>
+              <w:rPr>
+                <w:sz w:val="16"/>
+              </w:rPr>
+              <w:t>1.148</w:t>
+            </w:r>
+          </w:p>
+        </w:tc>
+        <w:tc>
+          <w:tcPr>
+            <w:tcW w:type="dxa" w:w="1376"/>
+          </w:tcPr>
+          <w:p>
+            <w:pPr>
+              <w:jc w:val="center"/>
+            </w:pPr>
+            <w:r>
+              <w:rPr>
+                <w:sz w:val="16"/>
+              </w:rPr>
+              <w:t>positive</w:t>
+            </w:r>
+          </w:p>
+        </w:tc>
+        <w:tc>
+          <w:tcPr>
+            <w:tcW w:type="dxa" w:w="1376"/>
+          </w:tcPr>
+          <w:p>
+            <w:pPr>
+              <w:jc w:val="center"/>
+            </w:pPr>
+            <w:r>
+              <w:rPr>
+                <w:sz w:val="16"/>
+              </w:rPr>
+              <w:t>BME staff 1.2x less likely to report positively</w:t>
             </w:r>
           </w:p>
         </w:tc>
@@ -20860,97 +21030,177 @@
       <w:tr>
         <w:tc>
           <w:tcPr>
-            <w:tcW w:type="dxa" w:w="2523"/>
-          </w:tcPr>
-          <w:p>
-            <w:pPr>
-              <w:jc w:val="center"/>
-            </w:pPr>
-            <w:r>
-              <w:rPr>
-                <w:sz w:val="16"/>
-              </w:rPr>
-              <w:t>discrim_patients</w:t>
-            </w:r>
-          </w:p>
-        </w:tc>
-        <w:tc>
-          <w:tcPr>
-            <w:tcW w:type="dxa" w:w="2523"/>
-          </w:tcPr>
-          <w:p>
-            <w:pPr>
-              <w:jc w:val="center"/>
-            </w:pPr>
-            <w:r>
-              <w:rPr>
-                <w:sz w:val="16"/>
-              </w:rPr>
-              <w:t>Q16a: Discrimination from patients (% Yes)</w:t>
-            </w:r>
-          </w:p>
-        </w:tc>
-        <w:tc>
-          <w:tcPr>
-            <w:tcW w:type="dxa" w:w="2523"/>
-          </w:tcPr>
-          <w:p>
-            <w:pPr>
-              <w:jc w:val="center"/>
-            </w:pPr>
-            <w:r>
-              <w:rPr>
-                <w:sz w:val="16"/>
-              </w:rPr>
-              <w:t>263</w:t>
-            </w:r>
-          </w:p>
-        </w:tc>
-        <w:tc>
-          <w:tcPr>
-            <w:tcW w:type="dxa" w:w="2523"/>
-          </w:tcPr>
-          <w:p>
-            <w:pPr>
-              <w:jc w:val="center"/>
-            </w:pPr>
-            <w:r>
-              <w:rPr>
-                <w:sz w:val="16"/>
-              </w:rPr>
-              <w:t>0.559</w:t>
-            </w:r>
-          </w:p>
-        </w:tc>
-        <w:tc>
-          <w:tcPr>
-            <w:tcW w:type="dxa" w:w="2523"/>
-          </w:tcPr>
-          <w:p>
-            <w:pPr>
-              <w:jc w:val="center"/>
-            </w:pPr>
-            <w:r>
-              <w:rPr>
-                <w:sz w:val="16"/>
-              </w:rPr>
-              <w:t>0.000</w:t>
-            </w:r>
-          </w:p>
-        </w:tc>
-        <w:tc>
-          <w:tcPr>
-            <w:tcW w:type="dxa" w:w="2523"/>
-          </w:tcPr>
-          <w:p>
-            <w:pPr>
-              <w:jc w:val="center"/>
-            </w:pPr>
-            <w:r>
-              <w:rPr>
-                <w:sz w:val="16"/>
-              </w:rPr>
-              <w:t>Higher BME % -&gt; higher discrimination</w:t>
+            <w:tcW w:type="dxa" w:w="1376"/>
+          </w:tcPr>
+          <w:p>
+            <w:pPr>
+              <w:jc w:val="center"/>
+            </w:pPr>
+            <w:r>
+              <w:rPr>
+                <w:sz w:val="16"/>
+              </w:rPr>
+              <w:t>Q16b: Discrimination from manager/colleagues</w:t>
+            </w:r>
+          </w:p>
+        </w:tc>
+        <w:tc>
+          <w:tcPr>
+            <w:tcW w:type="dxa" w:w="1376"/>
+          </w:tcPr>
+          <w:p>
+            <w:pPr>
+              <w:jc w:val="center"/>
+            </w:pPr>
+            <w:r>
+              <w:rPr>
+                <w:sz w:val="16"/>
+              </w:rPr>
+              <w:t>159</w:t>
+            </w:r>
+          </w:p>
+        </w:tc>
+        <w:tc>
+          <w:tcPr>
+            <w:tcW w:type="dxa" w:w="1376"/>
+          </w:tcPr>
+          <w:p>
+            <w:pPr>
+              <w:jc w:val="center"/>
+            </w:pPr>
+            <w:r>
+              <w:rPr>
+                <w:sz w:val="16"/>
+              </w:rPr>
+              <w:t>2.302</w:t>
+            </w:r>
+          </w:p>
+        </w:tc>
+        <w:tc>
+          <w:tcPr>
+            <w:tcW w:type="dxa" w:w="1376"/>
+          </w:tcPr>
+          <w:p>
+            <w:pPr>
+              <w:jc w:val="center"/>
+            </w:pPr>
+            <w:r>
+              <w:rPr>
+                <w:sz w:val="16"/>
+              </w:rPr>
+              <w:t>2.389</w:t>
+            </w:r>
+          </w:p>
+        </w:tc>
+        <w:tc>
+          <w:tcPr>
+            <w:tcW w:type="dxa" w:w="1376"/>
+          </w:tcPr>
+          <w:p>
+            <w:pPr>
+              <w:jc w:val="center"/>
+            </w:pPr>
+            <w:r>
+              <w:rPr>
+                <w:sz w:val="16"/>
+              </w:rPr>
+              <w:t>0.668</w:t>
+            </w:r>
+          </w:p>
+        </w:tc>
+        <w:tc>
+          <w:tcPr>
+            <w:tcW w:type="dxa" w:w="1376"/>
+          </w:tcPr>
+          <w:p>
+            <w:pPr>
+              <w:jc w:val="center"/>
+            </w:pPr>
+            <w:r>
+              <w:rPr>
+                <w:sz w:val="16"/>
+              </w:rPr>
+              <w:t>1.228</w:t>
+            </w:r>
+          </w:p>
+        </w:tc>
+        <w:tc>
+          <w:tcPr>
+            <w:tcW w:type="dxa" w:w="1376"/>
+          </w:tcPr>
+          <w:p>
+            <w:pPr>
+              <w:jc w:val="center"/>
+            </w:pPr>
+            <w:r>
+              <w:rPr>
+                <w:sz w:val="16"/>
+              </w:rPr>
+              <w:t>1.937</w:t>
+            </w:r>
+          </w:p>
+        </w:tc>
+        <w:tc>
+          <w:tcPr>
+            <w:tcW w:type="dxa" w:w="1376"/>
+          </w:tcPr>
+          <w:p>
+            <w:pPr>
+              <w:jc w:val="center"/>
+            </w:pPr>
+            <w:r>
+              <w:rPr>
+                <w:sz w:val="16"/>
+              </w:rPr>
+              <w:t>2.731</w:t>
+            </w:r>
+          </w:p>
+        </w:tc>
+        <w:tc>
+          <w:tcPr>
+            <w:tcW w:type="dxa" w:w="1376"/>
+          </w:tcPr>
+          <w:p>
+            <w:pPr>
+              <w:jc w:val="center"/>
+            </w:pPr>
+            <w:r>
+              <w:rPr>
+                <w:sz w:val="16"/>
+              </w:rPr>
+              <w:t>4.881</w:t>
+            </w:r>
+          </w:p>
+        </w:tc>
+        <w:tc>
+          <w:tcPr>
+            <w:tcW w:type="dxa" w:w="1376"/>
+          </w:tcPr>
+          <w:p>
+            <w:pPr>
+              <w:jc w:val="center"/>
+            </w:pPr>
+            <w:r>
+              <w:rPr>
+                <w:sz w:val="16"/>
+              </w:rPr>
+              <w:t>negative</w:t>
+            </w:r>
+          </w:p>
+        </w:tc>
+        <w:tc>
+          <w:tcPr>
+            <w:tcW w:type="dxa" w:w="1376"/>
+          </w:tcPr>
+          <w:p>
+            <w:pPr>
+              <w:jc w:val="center"/>
+            </w:pPr>
+            <w:r>
+              <w:rPr>
+                <w:sz w:val="16"/>
+              </w:rPr>
+              <w:t>BME staff 2.3x more likely</w:t>
             </w:r>
           </w:p>
         </w:tc>
@@ -20958,55 +21208,87 @@
       <w:tr>
         <w:tc>
           <w:tcPr>
-            <w:tcW w:type="dxa" w:w="2523"/>
-          </w:tcPr>
-          <w:p>
-            <w:pPr>
-              <w:jc w:val="center"/>
-            </w:pPr>
-            <w:r>
-              <w:rPr>
-                <w:sz w:val="16"/>
-              </w:rPr>
-              <w:t>discrim_colleagues</w:t>
-            </w:r>
-          </w:p>
-        </w:tc>
-        <w:tc>
-          <w:tcPr>
-            <w:tcW w:type="dxa" w:w="2523"/>
-          </w:tcPr>
-          <w:p>
-            <w:pPr>
-              <w:jc w:val="center"/>
-            </w:pPr>
-            <w:r>
-              <w:rPr>
-                <w:sz w:val="16"/>
-              </w:rPr>
-              <w:t>Q16b: Discrimination from colleagues (% Yes)</w:t>
-            </w:r>
-          </w:p>
-        </w:tc>
-        <w:tc>
-          <w:tcPr>
-            <w:tcW w:type="dxa" w:w="2523"/>
-          </w:tcPr>
-          <w:p>
-            <w:pPr>
-              <w:jc w:val="center"/>
-            </w:pPr>
-            <w:r>
-              <w:rPr>
-                <w:sz w:val="16"/>
-              </w:rPr>
-              <w:t>263</w:t>
-            </w:r>
-          </w:p>
-        </w:tc>
-        <w:tc>
-          <w:tcPr>
-            <w:tcW w:type="dxa" w:w="2523"/>
+            <w:tcW w:type="dxa" w:w="1376"/>
+          </w:tcPr>
+          <w:p>
+            <w:pPr>
+              <w:jc w:val="center"/>
+            </w:pPr>
+            <w:r>
+              <w:rPr>
+                <w:sz w:val="16"/>
+              </w:rPr>
+              <w:t>Harassment from patients (by ethnicity)</w:t>
+            </w:r>
+          </w:p>
+        </w:tc>
+        <w:tc>
+          <w:tcPr>
+            <w:tcW w:type="dxa" w:w="1376"/>
+          </w:tcPr>
+          <w:p>
+            <w:pPr>
+              <w:jc w:val="center"/>
+            </w:pPr>
+            <w:r>
+              <w:rPr>
+                <w:sz w:val="16"/>
+              </w:rPr>
+              <w:t>159</w:t>
+            </w:r>
+          </w:p>
+        </w:tc>
+        <w:tc>
+          <w:tcPr>
+            <w:tcW w:type="dxa" w:w="1376"/>
+          </w:tcPr>
+          <w:p>
+            <w:pPr>
+              <w:jc w:val="center"/>
+            </w:pPr>
+            <w:r>
+              <w:rPr>
+                <w:sz w:val="16"/>
+              </w:rPr>
+              <w:t>1.177</w:t>
+            </w:r>
+          </w:p>
+        </w:tc>
+        <w:tc>
+          <w:tcPr>
+            <w:tcW w:type="dxa" w:w="1376"/>
+          </w:tcPr>
+          <w:p>
+            <w:pPr>
+              <w:jc w:val="center"/>
+            </w:pPr>
+            <w:r>
+              <w:rPr>
+                <w:sz w:val="16"/>
+              </w:rPr>
+              <w:t>1.190</w:t>
+            </w:r>
+          </w:p>
+        </w:tc>
+        <w:tc>
+          <w:tcPr>
+            <w:tcW w:type="dxa" w:w="1376"/>
+          </w:tcPr>
+          <w:p>
+            <w:pPr>
+              <w:jc w:val="center"/>
+            </w:pPr>
+            <w:r>
+              <w:rPr>
+                <w:sz w:val="16"/>
+              </w:rPr>
+              <w:t>0.191</w:t>
+            </w:r>
+          </w:p>
+        </w:tc>
+        <w:tc>
+          <w:tcPr>
+            <w:tcW w:type="dxa" w:w="1376"/>
           </w:tcPr>
           <w:p>
             <w:pPr>
@@ -21022,33 +21304,81 @@
         </w:tc>
         <w:tc>
           <w:tcPr>
-            <w:tcW w:type="dxa" w:w="2523"/>
-          </w:tcPr>
-          <w:p>
-            <w:pPr>
-              <w:jc w:val="center"/>
-            </w:pPr>
-            <w:r>
-              <w:rPr>
-                <w:sz w:val="16"/>
-              </w:rPr>
-              <w:t>0.000</w:t>
-            </w:r>
-          </w:p>
-        </w:tc>
-        <w:tc>
-          <w:tcPr>
-            <w:tcW w:type="dxa" w:w="2523"/>
-          </w:tcPr>
-          <w:p>
-            <w:pPr>
-              <w:jc w:val="center"/>
-            </w:pPr>
-            <w:r>
-              <w:rPr>
-                <w:sz w:val="16"/>
-              </w:rPr>
-              <w:t>Higher BME % -&gt; higher discrimination</w:t>
+            <w:tcW w:type="dxa" w:w="1376"/>
+          </w:tcPr>
+          <w:p>
+            <w:pPr>
+              <w:jc w:val="center"/>
+            </w:pPr>
+            <w:r>
+              <w:rPr>
+                <w:sz w:val="16"/>
+              </w:rPr>
+              <w:t>1.083</w:t>
+            </w:r>
+          </w:p>
+        </w:tc>
+        <w:tc>
+          <w:tcPr>
+            <w:tcW w:type="dxa" w:w="1376"/>
+          </w:tcPr>
+          <w:p>
+            <w:pPr>
+              <w:jc w:val="center"/>
+            </w:pPr>
+            <w:r>
+              <w:rPr>
+                <w:sz w:val="16"/>
+              </w:rPr>
+              <w:t>1.320</w:t>
+            </w:r>
+          </w:p>
+        </w:tc>
+        <w:tc>
+          <w:tcPr>
+            <w:tcW w:type="dxa" w:w="1376"/>
+          </w:tcPr>
+          <w:p>
+            <w:pPr>
+              <w:jc w:val="center"/>
+            </w:pPr>
+            <w:r>
+              <w:rPr>
+                <w:sz w:val="16"/>
+              </w:rPr>
+              <w:t>1.681</w:t>
+            </w:r>
+          </w:p>
+        </w:tc>
+        <w:tc>
+          <w:tcPr>
+            <w:tcW w:type="dxa" w:w="1376"/>
+          </w:tcPr>
+          <w:p>
+            <w:pPr>
+              <w:jc w:val="center"/>
+            </w:pPr>
+            <w:r>
+              <w:rPr>
+                <w:sz w:val="16"/>
+              </w:rPr>
+              <w:t>negative</w:t>
+            </w:r>
+          </w:p>
+        </w:tc>
+        <w:tc>
+          <w:tcPr>
+            <w:tcW w:type="dxa" w:w="1376"/>
+          </w:tcPr>
+          <w:p>
+            <w:pPr>
+              <w:jc w:val="center"/>
+            </w:pPr>
+            <w:r>
+              <w:rPr>
+                <w:sz w:val="16"/>
+              </w:rPr>
+              <w:t>BME staff 1.2x more likely</w:t>
             </w:r>
           </w:p>
         </w:tc>
@@ -21056,283 +21386,177 @@
       <w:tr>
         <w:tc>
           <w:tcPr>
-            <w:tcW w:type="dxa" w:w="2523"/>
-          </w:tcPr>
-          <w:p>
-            <w:pPr>
-              <w:jc w:val="center"/>
-            </w:pPr>
-            <w:r>
-              <w:rPr>
-                <w:sz w:val="16"/>
-              </w:rPr>
-              <w:t>org_respects_differences</w:t>
-            </w:r>
-          </w:p>
-        </w:tc>
-        <w:tc>
-          <w:tcPr>
-            <w:tcW w:type="dxa" w:w="2523"/>
-          </w:tcPr>
-          <w:p>
-            <w:pPr>
-              <w:jc w:val="center"/>
-            </w:pPr>
-            <w:r>
-              <w:rPr>
-                <w:sz w:val="16"/>
-              </w:rPr>
-              <w:t>Q21: Org respects differences</w:t>
-            </w:r>
-          </w:p>
-        </w:tc>
-        <w:tc>
-          <w:tcPr>
-            <w:tcW w:type="dxa" w:w="2523"/>
-          </w:tcPr>
-          <w:p>
-            <w:pPr>
-              <w:jc w:val="center"/>
-            </w:pPr>
-            <w:r>
-              <w:rPr>
-                <w:sz w:val="16"/>
-              </w:rPr>
-              <w:t>263</w:t>
-            </w:r>
-          </w:p>
-        </w:tc>
-        <w:tc>
-          <w:tcPr>
-            <w:tcW w:type="dxa" w:w="2523"/>
-          </w:tcPr>
-          <w:p>
-            <w:pPr>
-              <w:jc w:val="center"/>
-            </w:pPr>
-            <w:r>
-              <w:rPr>
-                <w:sz w:val="16"/>
-              </w:rPr>
-              <w:t>-0.115</w:t>
-            </w:r>
-          </w:p>
-        </w:tc>
-        <w:tc>
-          <w:tcPr>
-            <w:tcW w:type="dxa" w:w="2523"/>
-          </w:tcPr>
-          <w:p>
-            <w:pPr>
-              <w:jc w:val="center"/>
-            </w:pPr>
-            <w:r>
-              <w:rPr>
-                <w:sz w:val="16"/>
-              </w:rPr>
-              <w:t>0.062</w:t>
-            </w:r>
-          </w:p>
-        </w:tc>
-        <w:tc>
-          <w:tcPr>
-            <w:tcW w:type="dxa" w:w="2523"/>
-          </w:tcPr>
-          <w:p>
-            <w:pPr>
-              <w:jc w:val="center"/>
-            </w:pPr>
-            <w:r>
-              <w:rPr>
-                <w:sz w:val="16"/>
-              </w:rPr>
-              <w:t>No significant relationship</w:t>
-            </w:r>
-          </w:p>
-        </w:tc>
-      </w:tr>
-      <w:tr>
-        <w:tc>
-          <w:tcPr>
-            <w:tcW w:type="dxa" w:w="2523"/>
-          </w:tcPr>
-          <w:p>
-            <w:pPr>
-              <w:jc w:val="center"/>
-            </w:pPr>
-            <w:r>
-              <w:rPr>
-                <w:sz w:val="16"/>
-              </w:rPr>
-            </w:r>
-          </w:p>
-        </w:tc>
-        <w:tc>
-          <w:tcPr>
-            <w:tcW w:type="dxa" w:w="2523"/>
-          </w:tcPr>
-          <w:p>
-            <w:pPr>
-              <w:jc w:val="center"/>
-            </w:pPr>
-            <w:r>
-              <w:rPr>
-                <w:sz w:val="16"/>
-              </w:rPr>
-            </w:r>
-          </w:p>
-        </w:tc>
-        <w:tc>
-          <w:tcPr>
-            <w:tcW w:type="dxa" w:w="2523"/>
-          </w:tcPr>
-          <w:p>
-            <w:pPr>
-              <w:jc w:val="center"/>
-            </w:pPr>
-            <w:r>
-              <w:rPr>
-                <w:sz w:val="16"/>
-              </w:rPr>
-            </w:r>
-          </w:p>
-        </w:tc>
-        <w:tc>
-          <w:tcPr>
-            <w:tcW w:type="dxa" w:w="2523"/>
-          </w:tcPr>
-          <w:p>
-            <w:pPr>
-              <w:jc w:val="center"/>
-            </w:pPr>
-            <w:r>
-              <w:rPr>
-                <w:sz w:val="16"/>
-              </w:rPr>
-            </w:r>
-          </w:p>
-        </w:tc>
-        <w:tc>
-          <w:tcPr>
-            <w:tcW w:type="dxa" w:w="2523"/>
-          </w:tcPr>
-          <w:p>
-            <w:pPr>
-              <w:jc w:val="center"/>
-            </w:pPr>
-            <w:r>
-              <w:rPr>
-                <w:sz w:val="16"/>
-              </w:rPr>
-            </w:r>
-          </w:p>
-        </w:tc>
-        <w:tc>
-          <w:tcPr>
-            <w:tcW w:type="dxa" w:w="2523"/>
-          </w:tcPr>
-          <w:p>
-            <w:pPr>
-              <w:jc w:val="center"/>
-            </w:pPr>
-            <w:r>
-              <w:rPr>
-                <w:sz w:val="16"/>
-              </w:rPr>
-            </w:r>
-          </w:p>
-        </w:tc>
-      </w:tr>
-      <w:tr>
-        <w:tc>
-          <w:tcPr>
-            <w:tcW w:type="dxa" w:w="2523"/>
-          </w:tcPr>
-          <w:p>
-            <w:pPr>
-              <w:jc w:val="center"/>
-            </w:pPr>
-            <w:r>
-              <w:rPr>
-                <w:sz w:val="16"/>
-              </w:rPr>
-              <w:t>NOTE</w:t>
-            </w:r>
-          </w:p>
-        </w:tc>
-        <w:tc>
-          <w:tcPr>
-            <w:tcW w:type="dxa" w:w="2523"/>
-          </w:tcPr>
-          <w:p>
-            <w:pPr>
-              <w:jc w:val="center"/>
-            </w:pPr>
-            <w:r>
-              <w:rPr>
-                <w:sz w:val="16"/>
-              </w:rPr>
-              <w:t>These are ECOLOGICAL correlations (org-level % BME vs org-level discrimination rate). The true likelihood ratio P(discrim|BME)/P(discrim|White) requires individual-level data or WRES indicator breakdowns, which are not in this dataset. A positive correlation means orgs with more BME staff also have higher discrimination rates, which is consistent with but NOT the same as a BME/White likelihood ratio.</w:t>
-            </w:r>
-          </w:p>
-        </w:tc>
-        <w:tc>
-          <w:tcPr>
-            <w:tcW w:type="dxa" w:w="2523"/>
-          </w:tcPr>
-          <w:p>
-            <w:pPr>
-              <w:jc w:val="center"/>
-            </w:pPr>
-            <w:r>
-              <w:rPr>
-                <w:sz w:val="16"/>
-              </w:rPr>
-            </w:r>
-          </w:p>
-        </w:tc>
-        <w:tc>
-          <w:tcPr>
-            <w:tcW w:type="dxa" w:w="2523"/>
-          </w:tcPr>
-          <w:p>
-            <w:pPr>
-              <w:jc w:val="center"/>
-            </w:pPr>
-            <w:r>
-              <w:rPr>
-                <w:sz w:val="16"/>
-              </w:rPr>
-            </w:r>
-          </w:p>
-        </w:tc>
-        <w:tc>
-          <w:tcPr>
-            <w:tcW w:type="dxa" w:w="2523"/>
-          </w:tcPr>
-          <w:p>
-            <w:pPr>
-              <w:jc w:val="center"/>
-            </w:pPr>
-            <w:r>
-              <w:rPr>
-                <w:sz w:val="16"/>
-              </w:rPr>
-            </w:r>
-          </w:p>
-        </w:tc>
-        <w:tc>
-          <w:tcPr>
-            <w:tcW w:type="dxa" w:w="2523"/>
-          </w:tcPr>
-          <w:p>
-            <w:pPr>
-              <w:jc w:val="center"/>
-            </w:pPr>
-            <w:r>
-              <w:rPr>
-                <w:sz w:val="16"/>
-              </w:rPr>
+            <w:tcW w:type="dxa" w:w="1376"/>
+          </w:tcPr>
+          <w:p>
+            <w:pPr>
+              <w:jc w:val="center"/>
+            </w:pPr>
+            <w:r>
+              <w:rPr>
+                <w:sz w:val="16"/>
+              </w:rPr>
+              <w:t>Harassment from staff (by ethnicity)</w:t>
+            </w:r>
+          </w:p>
+        </w:tc>
+        <w:tc>
+          <w:tcPr>
+            <w:tcW w:type="dxa" w:w="1376"/>
+          </w:tcPr>
+          <w:p>
+            <w:pPr>
+              <w:jc w:val="center"/>
+            </w:pPr>
+            <w:r>
+              <w:rPr>
+                <w:sz w:val="16"/>
+              </w:rPr>
+              <w:t>159</w:t>
+            </w:r>
+          </w:p>
+        </w:tc>
+        <w:tc>
+          <w:tcPr>
+            <w:tcW w:type="dxa" w:w="1376"/>
+          </w:tcPr>
+          <w:p>
+            <w:pPr>
+              <w:jc w:val="center"/>
+            </w:pPr>
+            <w:r>
+              <w:rPr>
+                <w:sz w:val="16"/>
+              </w:rPr>
+              <w:t>1.171</w:t>
+            </w:r>
+          </w:p>
+        </w:tc>
+        <w:tc>
+          <w:tcPr>
+            <w:tcW w:type="dxa" w:w="1376"/>
+          </w:tcPr>
+          <w:p>
+            <w:pPr>
+              <w:jc w:val="center"/>
+            </w:pPr>
+            <w:r>
+              <w:rPr>
+                <w:sz w:val="16"/>
+              </w:rPr>
+              <w:t>1.197</w:t>
+            </w:r>
+          </w:p>
+        </w:tc>
+        <w:tc>
+          <w:tcPr>
+            <w:tcW w:type="dxa" w:w="1376"/>
+          </w:tcPr>
+          <w:p>
+            <w:pPr>
+              <w:jc w:val="center"/>
+            </w:pPr>
+            <w:r>
+              <w:rPr>
+                <w:sz w:val="16"/>
+              </w:rPr>
+              <w:t>0.191</w:t>
+            </w:r>
+          </w:p>
+        </w:tc>
+        <w:tc>
+          <w:tcPr>
+            <w:tcW w:type="dxa" w:w="1376"/>
+          </w:tcPr>
+          <w:p>
+            <w:pPr>
+              <w:jc w:val="center"/>
+            </w:pPr>
+            <w:r>
+              <w:rPr>
+                <w:sz w:val="16"/>
+              </w:rPr>
+              <w:t>0.751</w:t>
+            </w:r>
+          </w:p>
+        </w:tc>
+        <w:tc>
+          <w:tcPr>
+            <w:tcW w:type="dxa" w:w="1376"/>
+          </w:tcPr>
+          <w:p>
+            <w:pPr>
+              <w:jc w:val="center"/>
+            </w:pPr>
+            <w:r>
+              <w:rPr>
+                <w:sz w:val="16"/>
+              </w:rPr>
+              <w:t>1.070</w:t>
+            </w:r>
+          </w:p>
+        </w:tc>
+        <w:tc>
+          <w:tcPr>
+            <w:tcW w:type="dxa" w:w="1376"/>
+          </w:tcPr>
+          <w:p>
+            <w:pPr>
+              <w:jc w:val="center"/>
+            </w:pPr>
+            <w:r>
+              <w:rPr>
+                <w:sz w:val="16"/>
+              </w:rPr>
+              <w:t>1.301</w:t>
+            </w:r>
+          </w:p>
+        </w:tc>
+        <w:tc>
+          <w:tcPr>
+            <w:tcW w:type="dxa" w:w="1376"/>
+          </w:tcPr>
+          <w:p>
+            <w:pPr>
+              <w:jc w:val="center"/>
+            </w:pPr>
+            <w:r>
+              <w:rPr>
+                <w:sz w:val="16"/>
+              </w:rPr>
+              <w:t>2.041</w:t>
+            </w:r>
+          </w:p>
+        </w:tc>
+        <w:tc>
+          <w:tcPr>
+            <w:tcW w:type="dxa" w:w="1376"/>
+          </w:tcPr>
+          <w:p>
+            <w:pPr>
+              <w:jc w:val="center"/>
+            </w:pPr>
+            <w:r>
+              <w:rPr>
+                <w:sz w:val="16"/>
+              </w:rPr>
+              <w:t>negative</w:t>
+            </w:r>
+          </w:p>
+        </w:tc>
+        <w:tc>
+          <w:tcPr>
+            <w:tcW w:type="dxa" w:w="1376"/>
+          </w:tcPr>
+          <w:p>
+            <w:pPr>
+              <w:jc w:val="center"/>
+            </w:pPr>
+            <w:r>
+              <w:rPr>
+                <w:sz w:val="16"/>
+              </w:rPr>
+              <w:t>BME staff 1.2x more likely</w:t>
             </w:r>
           </w:p>
         </w:tc>
@@ -21340,40 +21564,8 @@
     </w:tbl>
     <w:p/>
     <w:p>
-      <w:pPr>
-        <w:pStyle w:val="Heading3"/>
-      </w:pPr>
       <w:r>
-        <w:t>What is needed for the true likelihood ratio</w:t>
-      </w:r>
-    </w:p>
-    <w:p>
-      <w:r>
-        <w:t>To compute the actual likelihood ratio for the NOF score, you would need either:</w:t>
-      </w:r>
-    </w:p>
-    <w:p>
-      <w:pPr>
-        <w:pStyle w:val="ListBullet"/>
-      </w:pPr>
-      <w:r>
-        <w:t>1. WRES (Workforce Race Equality Standard) indicators, which provide Q15 and Q16 results separately for BME and White staff at each trust; or</w:t>
-      </w:r>
-    </w:p>
-    <w:p>
-      <w:pPr>
-        <w:pStyle w:val="ListBullet"/>
-      </w:pPr>
-      <w:r>
-        <w:t>2. Individual-level NSS response data with ethnicity, to compute P(discrim | BME) / P(discrim | White) per organisation; or</w:t>
-      </w:r>
-    </w:p>
-    <w:p>
-      <w:pPr>
-        <w:pStyle w:val="ListBullet"/>
-      </w:pPr>
-      <w:r>
-        <w:t>3. The NSS demographic breakdowns (if NHS England publishes Q15/Q16 by ethnicity at org level).</w:t>
+        <w:t>The per-trust detail is provided in the Excel workbook ('Racism LR Per Trust' tab). Trusts with very small BME sample sizes may have unstable likelihood ratios.</w:t>
       </w:r>
     </w:p>
     <w:p>

</xml_diff>